<commit_message>
docs(dossier): ajuster competences, retirer PDE, espagnol et projets perso
Flink compte aussi l'annee chez papernest, Git et CI/CD datent de
Bouygues, Docker est pratique chez papernest. Le chiffre de l'editeur
YAML ne figure plus qu'une fois, dans l'experience, formule en contexte.

Co-Authored-By: Claude Opus 5 <noreply@anthropic.com>
</commit_message>
<xml_diff>
--- a/dossier-competences/Dossier_competences_Etienne_C_Data_Engineer.docx
+++ b/dossier-competences/Dossier_competences_Etienne_C_Data_Engineer.docx
@@ -307,7 +307,7 @@
                 <w:i w:val="0"/>
                 <w:sz w:val="19"/>
               </w:rPr>
-              <w:t>Google Cloud Digital Leader · Professional Data Engineer en préparation</w:t>
+              <w:t>Google Cloud Digital Leader</w:t>
             </w:r>
           </w:p>
         </w:tc>
@@ -439,7 +439,7 @@
           <w:i w:val="0"/>
           <w:sz w:val="20"/>
         </w:rPr>
-        <w:t xml:space="preserve">Résultats mesurés : </w:t>
+        <w:t xml:space="preserve">Outillage au service des métiers : </w:t>
       </w:r>
       <w:r>
         <w:rPr>
@@ -447,7 +447,7 @@
           <w:i w:val="0"/>
           <w:sz w:val="20"/>
         </w:rPr>
-        <w:t>éditeur de configuration YAML qui a réduit de ~50 % le temps de fabrication des pipelines et fait passer l'investigation d'incidents de 30–60 min à moins de 2 min.</w:t>
+        <w:t>conception d'outils internes pensés pour les usages réels des équipes, techniques ou non : éditeur de configuration des pipelines, outils à base de LLM.</w:t>
       </w:r>
     </w:p>
     <w:p>
@@ -811,7 +811,7 @@
                 <w:color w:val="1E252D"/>
                 <w:sz w:val="19"/>
               </w:rPr>
-              <w:t>Bouygues Telecom, 3 ans</w:t>
+              <w:t>Bouygues Telecom (3 ans) puis papernest (1 an)</w:t>
             </w:r>
           </w:p>
         </w:tc>
@@ -1031,7 +1031,7 @@
                 <w:color w:val="1E252D"/>
                 <w:sz w:val="19"/>
               </w:rPr>
-              <w:t>missions et projets personnels</w:t>
+              <w:t>Bouygues Telecom puis papernest, depuis 2022</w:t>
             </w:r>
           </w:p>
         </w:tc>
@@ -1049,7 +1049,7 @@
                 <w:color w:val="1E252D"/>
                 <w:sz w:val="19"/>
               </w:rPr>
-              <w:t>Docker, Linux, Caddy</w:t>
+              <w:t>Docker, Linux</w:t>
             </w:r>
           </w:p>
         </w:tc>
@@ -1081,7 +1081,7 @@
                 <w:color w:val="1E252D"/>
                 <w:sz w:val="19"/>
               </w:rPr>
-              <w:t>services auto-hébergés sur VPS</w:t>
+              <w:t>papernest · services auto-hébergés sur VPS</w:t>
             </w:r>
           </w:p>
         </w:tc>
@@ -1201,7 +1201,7 @@
                 <w:color w:val="1E252D"/>
                 <w:sz w:val="19"/>
               </w:rPr>
-              <w:t>Bouygues Telecom, stage Ag2ir</w:t>
+              <w:t>Bouygues Telecom (3 ans), stage Ag2ir</w:t>
             </w:r>
           </w:p>
         </w:tc>
@@ -1510,7 +1510,7 @@
           <w:i w:val="0"/>
           <w:sz w:val="20"/>
         </w:rPr>
-        <w:t>conception et développement d'un outil (Next.js, React) permettant de configurer les flux sans risque. Temps de fabrication et de test des pipelines réduit de ~50 %, investigation d'incidents ramenée de 30–60 min à moins de 2 min.</w:t>
+        <w:t>conception et développement d'un outil (Next.js, React) qui sécurise la configuration des flux, y compris pour les équipes non techniques. Le temps de fabrication et de test d'un pipeline a été divisé par deux environ, et l'investigation d'un incident est passée de 30 à 60 minutes à moins de 2 minutes.</w:t>
       </w:r>
     </w:p>
     <w:p>
@@ -1578,7 +1578,7 @@
           <w:i w:val="0"/>
           <w:sz w:val="19"/>
         </w:rPr>
-        <w:t>Python, dbt, BigQuery, SQL, GCP, data contracts, YAML, Next.js, React, TypeScript, Tailwind CSS, Git, CI/CD, APIs LLM.</w:t>
+        <w:t>Python, dbt, BigQuery, SQL, Apache Flink, GCP, data contracts, Docker, YAML, Next.js, React, TypeScript, Tailwind CSS, Git, CI/CD, APIs LLM.</w:t>
       </w:r>
     </w:p>
     <w:tbl>
@@ -2218,39 +2218,6 @@
           </w:p>
         </w:tc>
       </w:tr>
-      <w:tr>
-        <w:tc>
-          <w:tcPr>
-            <w:tcW w:type="dxa" w:w="1474"/>
-          </w:tcPr>
-          <w:p>
-            <w:r>
-              <w:rPr>
-                <w:b/>
-                <w:i w:val="0"/>
-                <w:color w:val="1F6FB2"/>
-                <w:sz w:val="20"/>
-              </w:rPr>
-              <w:t>En cours</w:t>
-            </w:r>
-          </w:p>
-        </w:tc>
-        <w:tc>
-          <w:tcPr>
-            <w:tcW w:type="dxa" w:w="8391"/>
-          </w:tcPr>
-          <w:p>
-            <w:r>
-              <w:rPr>
-                <w:b w:val="0"/>
-                <w:i w:val="0"/>
-                <w:sz w:val="20"/>
-              </w:rPr>
-              <w:t>Google Cloud Professional Data Engineer, en préparation.</w:t>
-            </w:r>
-          </w:p>
-        </w:tc>
-      </w:tr>
     </w:tbl>
     <w:p>
       <w:pPr>
@@ -2314,93 +2281,6 @@
           <w:sz w:val="20"/>
         </w:rPr>
         <w:t>professionnel, langue de travail au quotidien chez papernest (TOEIC 880/990).</w:t>
-      </w:r>
-    </w:p>
-    <w:p>
-      <w:pPr>
-        <w:pStyle w:val="ListBullet"/>
-        <w:spacing w:after="40"/>
-        <w:ind w:left="340" w:hanging="227"/>
-      </w:pPr>
-      <w:r>
-        <w:rPr>
-          <w:b/>
-          <w:i w:val="0"/>
-          <w:sz w:val="20"/>
-        </w:rPr>
-        <w:t xml:space="preserve">Espagnol : </w:t>
-      </w:r>
-      <w:r>
-        <w:rPr>
-          <w:b w:val="0"/>
-          <w:i w:val="0"/>
-          <w:sz w:val="20"/>
-        </w:rPr>
-        <w:t>notions, en cours d'apprentissage.</w:t>
-      </w:r>
-    </w:p>
-    <w:p>
-      <w:pPr>
-        <w:spacing w:before="240" w:after="100"/>
-        <w:keepNext/>
-        <w:pBdr>
-          <w:bottom w:val="single" w:sz="8" w:space="2" w:color="1F6FB2"/>
-        </w:pBdr>
-      </w:pPr>
-      <w:r>
-        <w:rPr>
-          <w:b/>
-          <w:i w:val="0"/>
-          <w:color w:val="0B2E4F"/>
-          <w:sz w:val="24"/>
-        </w:rPr>
-        <w:t>PROJETS PERSONNELS</w:t>
-      </w:r>
-    </w:p>
-    <w:p>
-      <w:pPr>
-        <w:pStyle w:val="ListBullet"/>
-        <w:spacing w:after="40"/>
-        <w:ind w:left="340" w:hanging="227"/>
-      </w:pPr>
-      <w:r>
-        <w:rPr>
-          <w:b/>
-          <w:i w:val="0"/>
-          <w:sz w:val="20"/>
-        </w:rPr>
-        <w:t xml:space="preserve">Outils en ligne : </w:t>
-      </w:r>
-      <w:r>
-        <w:rPr>
-          <w:b w:val="0"/>
-          <w:i w:val="0"/>
-          <w:sz w:val="20"/>
-        </w:rPr>
-        <w:t>API Node.js de génération d'images de posts LinkedIn, en production sur un VPS personnel (Docker, reverse proxy Caddy, déploiement par GitHub Actions).</w:t>
-      </w:r>
-    </w:p>
-    <w:p>
-      <w:pPr>
-        <w:pStyle w:val="ListBullet"/>
-        <w:spacing w:after="40"/>
-        <w:ind w:left="340" w:hanging="227"/>
-      </w:pPr>
-      <w:r>
-        <w:rPr>
-          <w:b/>
-          <w:i w:val="0"/>
-          <w:sz w:val="20"/>
-        </w:rPr>
-        <w:t xml:space="preserve">Auto-hébergement : </w:t>
-      </w:r>
-      <w:r>
-        <w:rPr>
-          <w:b w:val="0"/>
-          <w:i w:val="0"/>
-          <w:sz w:val="20"/>
-        </w:rPr>
-        <w:t>administration d'un VPS Linux hébergeant plusieurs services, avec DNS, TLS et configuration versionnée sous Git.</w:t>
       </w:r>
     </w:p>
     <w:sectPr>

</xml_diff>

<commit_message>
docs(dossier): Flink un an chez Bouygues seulement, Docker un an chez papernest
Co-Authored-By: Claude Opus 5 <noreply@anthropic.com>
</commit_message>
<xml_diff>
--- a/dossier-competences/Dossier_competences_Etienne_C_Data_Engineer.docx
+++ b/dossier-competences/Dossier_competences_Etienne_C_Data_Engineer.docx
@@ -811,7 +811,7 @@
                 <w:color w:val="1E252D"/>
                 <w:sz w:val="19"/>
               </w:rPr>
-              <w:t>Bouygues Telecom (3 ans) puis papernest (1 an)</w:t>
+              <w:t>Bouygues Telecom (1 an)</w:t>
             </w:r>
           </w:p>
         </w:tc>
@@ -1081,7 +1081,7 @@
                 <w:color w:val="1E252D"/>
                 <w:sz w:val="19"/>
               </w:rPr>
-              <w:t>papernest · services auto-hébergés sur VPS</w:t>
+              <w:t>papernest (1 an) · services auto-hébergés sur VPS</w:t>
             </w:r>
           </w:p>
         </w:tc>
@@ -1578,7 +1578,7 @@
           <w:i w:val="0"/>
           <w:sz w:val="19"/>
         </w:rPr>
-        <w:t>Python, dbt, BigQuery, SQL, Apache Flink, GCP, data contracts, Docker, YAML, Next.js, React, TypeScript, Tailwind CSS, Git, CI/CD, APIs LLM.</w:t>
+        <w:t>Python, dbt, BigQuery, SQL, GCP, data contracts, Docker, YAML, Next.js, React, TypeScript, Tailwind CSS, Git, CI/CD, APIs LLM.</w:t>
       </w:r>
     </w:p>
     <w:tbl>

</xml_diff>

<commit_message>
docs(dossier): methodologie Scrum chez papernest, Kanban chez Bouygues, Jira
Co-Authored-By: Claude Opus 5 <noreply@anthropic.com>
</commit_message>
<xml_diff>
--- a/dossier-competences/Dossier_competences_Etienne_C_Data_Engineer.docx
+++ b/dossier-competences/Dossier_competences_Etienne_C_Data_Engineer.docx
@@ -1256,6 +1256,176 @@
           </w:p>
         </w:tc>
       </w:tr>
+      <w:tr>
+        <w:tc>
+          <w:tcPr>
+            <w:tcW w:type="dxa" w:w="4649"/>
+            <w:gridSpan w:val="3"/>
+            <w:shd w:val="clear" w:color="auto" w:fill="EEF3F8"/>
+          </w:tcPr>
+          <w:p>
+            <w:r>
+              <w:rPr>
+                <w:b/>
+                <w:i w:val="0"/>
+                <w:color w:val="0B2E4F"/>
+                <w:sz w:val="19"/>
+              </w:rPr>
+              <w:t>Méthodologie</w:t>
+            </w:r>
+          </w:p>
+        </w:tc>
+      </w:tr>
+      <w:tr>
+        <w:tc>
+          <w:tcPr>
+            <w:tcW w:type="dxa" w:w="3742"/>
+          </w:tcPr>
+          <w:p>
+            <w:r>
+              <w:rPr>
+                <w:b w:val="0"/>
+                <w:i w:val="0"/>
+                <w:color w:val="1E252D"/>
+                <w:sz w:val="19"/>
+              </w:rPr>
+              <w:t>Scrum (sprints de 2 semaines)</w:t>
+            </w:r>
+          </w:p>
+        </w:tc>
+        <w:tc>
+          <w:tcPr>
+            <w:tcW w:type="dxa" w:w="1474"/>
+          </w:tcPr>
+          <w:p>
+            <w:r>
+              <w:rPr>
+                <w:b/>
+                <w:i w:val="0"/>
+                <w:color w:val="1F6FB2"/>
+                <w:sz w:val="19"/>
+              </w:rPr>
+              <w:t>Opérationnel</w:t>
+            </w:r>
+          </w:p>
+        </w:tc>
+        <w:tc>
+          <w:tcPr>
+            <w:tcW w:type="dxa" w:w="4649"/>
+          </w:tcPr>
+          <w:p>
+            <w:r>
+              <w:rPr>
+                <w:b w:val="0"/>
+                <w:i w:val="0"/>
+                <w:color w:val="1E252D"/>
+                <w:sz w:val="19"/>
+              </w:rPr>
+              <w:t>papernest : daily, grooming technique et métier, sprint review</w:t>
+            </w:r>
+          </w:p>
+        </w:tc>
+      </w:tr>
+      <w:tr>
+        <w:tc>
+          <w:tcPr>
+            <w:tcW w:type="dxa" w:w="3742"/>
+          </w:tcPr>
+          <w:p>
+            <w:r>
+              <w:rPr>
+                <w:b w:val="0"/>
+                <w:i w:val="0"/>
+                <w:color w:val="1E252D"/>
+                <w:sz w:val="19"/>
+              </w:rPr>
+              <w:t>Kanban</w:t>
+            </w:r>
+          </w:p>
+        </w:tc>
+        <w:tc>
+          <w:tcPr>
+            <w:tcW w:type="dxa" w:w="1474"/>
+          </w:tcPr>
+          <w:p>
+            <w:r>
+              <w:rPr>
+                <w:b/>
+                <w:i w:val="0"/>
+                <w:color w:val="1F6FB2"/>
+                <w:sz w:val="19"/>
+              </w:rPr>
+              <w:t>Opérationnel</w:t>
+            </w:r>
+          </w:p>
+        </w:tc>
+        <w:tc>
+          <w:tcPr>
+            <w:tcW w:type="dxa" w:w="4649"/>
+          </w:tcPr>
+          <w:p>
+            <w:r>
+              <w:rPr>
+                <w:b w:val="0"/>
+                <w:i w:val="0"/>
+                <w:color w:val="1E252D"/>
+                <w:sz w:val="19"/>
+              </w:rPr>
+              <w:t>Bouygues Telecom (3 ans)</w:t>
+            </w:r>
+          </w:p>
+        </w:tc>
+      </w:tr>
+      <w:tr>
+        <w:tc>
+          <w:tcPr>
+            <w:tcW w:type="dxa" w:w="3742"/>
+          </w:tcPr>
+          <w:p>
+            <w:r>
+              <w:rPr>
+                <w:b w:val="0"/>
+                <w:i w:val="0"/>
+                <w:color w:val="1E252D"/>
+                <w:sz w:val="19"/>
+              </w:rPr>
+              <w:t>Jira</w:t>
+            </w:r>
+          </w:p>
+        </w:tc>
+        <w:tc>
+          <w:tcPr>
+            <w:tcW w:type="dxa" w:w="1474"/>
+          </w:tcPr>
+          <w:p>
+            <w:r>
+              <w:rPr>
+                <w:b/>
+                <w:i w:val="0"/>
+                <w:color w:val="1F6FB2"/>
+                <w:sz w:val="19"/>
+              </w:rPr>
+              <w:t>Confirmé</w:t>
+            </w:r>
+          </w:p>
+        </w:tc>
+        <w:tc>
+          <w:tcPr>
+            <w:tcW w:type="dxa" w:w="4649"/>
+          </w:tcPr>
+          <w:p>
+            <w:r>
+              <w:rPr>
+                <w:b w:val="0"/>
+                <w:i w:val="0"/>
+                <w:color w:val="1E252D"/>
+                <w:sz w:val="19"/>
+              </w:rPr>
+              <w:t>Bouygues Telecom puis papernest, depuis 2022</w:t>
+            </w:r>
+          </w:p>
+        </w:tc>
+      </w:tr>
     </w:tbl>
     <w:p>
       <w:pPr>
@@ -1403,7 +1573,7 @@
           <w:color w:val="1E252D"/>
           <w:sz w:val="20"/>
         </w:rPr>
-        <w:t>Scale-up qui simplifie la gestion des contrats du quotidien (énergie, box internet, assurance) sur les marchés français, espagnol et italien. Seul Data Engineer sur le site de Barcelone, dans une stack data en transition d'un fonctionnement historique vers une plateforme fiable.</w:t>
+        <w:t>Scale-up qui simplifie la gestion des contrats du quotidien (énergie, box internet, assurance) sur les marchés français, espagnol et italien. Seul Data Engineer sur le site de Barcelone, dans une stack data en transition d'un fonctionnement historique vers une plateforme fiable. Organisation Scrum en sprints de deux semaines sous Jira : daily, grooming technique et métier, sprint review.</w:t>
       </w:r>
     </w:p>
     <w:p>
@@ -1578,7 +1748,7 @@
           <w:i w:val="0"/>
           <w:sz w:val="19"/>
         </w:rPr>
-        <w:t>Python, dbt, BigQuery, SQL, GCP, data contracts, Docker, YAML, Next.js, React, TypeScript, Tailwind CSS, Git, CI/CD, APIs LLM.</w:t>
+        <w:t>Python, dbt, BigQuery, SQL, GCP, data contracts, Docker, YAML, Next.js, React, TypeScript, Tailwind CSS, Git, CI/CD, APIs LLM, Jira, Scrum.</w:t>
       </w:r>
     </w:p>
     <w:tbl>
@@ -1695,7 +1865,7 @@
           <w:color w:val="1E252D"/>
           <w:sz w:val="20"/>
         </w:rPr>
-        <w:t>Alternance de trois ans en parallèle du cycle ingénieur, au sein de l'équipe data d'un opérateur télécom national : plateforme interne d'analyse de logs, ETL central et outillage de gouvernance.</w:t>
+        <w:t>Alternance de trois ans en parallèle du cycle ingénieur, au sein de l'équipe data d'un opérateur télécom national : plateforme interne d'analyse de logs, ETL central et outillage de gouvernance. Organisation en Kanban sous Jira.</w:t>
       </w:r>
     </w:p>
     <w:p>
@@ -1824,7 +1994,7 @@
           <w:i w:val="0"/>
           <w:sz w:val="19"/>
         </w:rPr>
-        <w:t>Java, Spring Boot, React, ElasticSearch, MongoDB, Apache Flink (SQL), BigQuery, Teradata, Hadoop, Docusaurus, Git.</w:t>
+        <w:t>Java, Spring Boot, React, ElasticSearch, MongoDB, Apache Flink (SQL), BigQuery, Teradata, Hadoop, Docusaurus, Git, Jira, Kanban.</w:t>
       </w:r>
     </w:p>
     <w:tbl>

</xml_diff>